<commit_message>
feat: actualizar plantilla Word (plantilla_ot.docx) con cambios locales
</commit_message>
<xml_diff>
--- a/static/plantilla_ot.docx
+++ b/static/plantilla_ot.docx
@@ -44,7 +44,7 @@
     <w:tbl>
       <w:tblPr>
         <w:tblStyle w:val="Table1"/>
-        <w:tblW w:w="2112.2598425196848" w:type="dxa"/>
+        <w:tblW w:w="3105.0" w:type="dxa"/>
         <w:jc w:val="left"/>
         <w:tblInd w:w="377.0" w:type="dxa"/>
         <w:tblBorders>
@@ -59,12 +59,12 @@
         <w:tblLook w:val="0000"/>
       </w:tblPr>
       <w:tblGrid>
-        <w:gridCol w:w="1263"/>
-        <w:gridCol w:w="849.2598425196852"/>
+        <w:gridCol w:w="1635"/>
+        <w:gridCol w:w="1470"/>
         <w:tblGridChange w:id="0">
           <w:tblGrid>
-            <w:gridCol w:w="1263"/>
-            <w:gridCol w:w="849.2598425196852"/>
+            <w:gridCol w:w="1635"/>
+            <w:gridCol w:w="1470"/>
           </w:tblGrid>
         </w:tblGridChange>
       </w:tblGrid>
@@ -1963,7 +1963,7 @@
         <wp:inline distB="114300" distT="114300" distL="114300" distR="114300">
           <wp:extent cx="2305050" cy="700088"/>
           <wp:effectExtent b="0" l="0" r="0" t="0"/>
-          <wp:docPr id="2" name="image1.jpg"/>
+          <wp:docPr id="1" name="image1.jpg"/>
           <a:graphic>
             <a:graphicData uri="http://schemas.openxmlformats.org/drawingml/2006/picture">
               <pic:pic>
@@ -2262,66 +2262,6 @@
       <w:sz w:val="72"/>
       <w:szCs w:val="72"/>
     </w:rPr>
-  </w:style>
-  <w:style w:type="table" w:styleId="TableNormal" w:default="1">
-    <w:name w:val="TableNormal"/>
-    <w:tblPr>
-      <w:tblCellMar>
-        <w:top w:w="100.0" w:type="dxa"/>
-        <w:left w:w="100.0" w:type="dxa"/>
-        <w:bottom w:w="100.0" w:type="dxa"/>
-        <w:right w:w="100.0" w:type="dxa"/>
-      </w:tblCellMar>
-    </w:tblPr>
-  </w:style>
-  <w:style w:type="paragraph" w:styleId="Normal" w:default="1">
-    <w:name w:val="normal"/>
-  </w:style>
-  <w:style w:type="table" w:styleId="Table1">
-    <w:basedOn w:val="TableNormal"/>
-    <w:tblPr>
-      <w:tblStyleRowBandSize w:val="1"/>
-      <w:tblStyleColBandSize w:val="1"/>
-      <w:tblCellMar>
-        <w:top w:w="0.0" w:type="dxa"/>
-        <w:left w:w="0.0" w:type="dxa"/>
-        <w:bottom w:w="0.0" w:type="dxa"/>
-        <w:right w:w="0.0" w:type="dxa"/>
-      </w:tblCellMar>
-    </w:tblPr>
-  </w:style>
-  <w:style w:type="table" w:styleId="Table2">
-    <w:basedOn w:val="TableNormal"/>
-    <w:tblPr>
-      <w:tblStyleRowBandSize w:val="1"/>
-      <w:tblStyleColBandSize w:val="1"/>
-      <w:tblCellMar>
-        <w:top w:w="0.0" w:type="dxa"/>
-        <w:left w:w="0.0" w:type="dxa"/>
-        <w:bottom w:w="0.0" w:type="dxa"/>
-        <w:right w:w="0.0" w:type="dxa"/>
-      </w:tblCellMar>
-    </w:tblPr>
-  </w:style>
-  <w:style w:type="table" w:styleId="Table3">
-    <w:basedOn w:val="TableNormal"/>
-    <w:tblPr>
-      <w:tblStyleRowBandSize w:val="1"/>
-      <w:tblStyleColBandSize w:val="1"/>
-      <w:tblCellMar>
-        <w:top w:w="0.0" w:type="dxa"/>
-        <w:left w:w="0.0" w:type="dxa"/>
-        <w:bottom w:w="0.0" w:type="dxa"/>
-        <w:right w:w="0.0" w:type="dxa"/>
-      </w:tblCellMar>
-    </w:tblPr>
-  </w:style>
-  <w:style w:type="table" w:styleId="Table4">
-    <w:basedOn w:val="TableNormal"/>
-    <w:tblPr>
-      <w:tblStyleRowBandSize w:val="1"/>
-      <w:tblStyleColBandSize w:val="1"/>
-    </w:tblPr>
   </w:style>
   <w:style w:type="paragraph" w:styleId="Subtitle">
     <w:name w:val="Subtitle"/>
@@ -2713,7 +2653,7 @@
 
 <file path=customXML/item1.xml><?xml version="1.0" encoding="utf-8"?>
 <go:gDocsCustomXmlDataStorage xmlns:go="http://customooxmlschemas.google.com/" xmlns:r="http://schemas.openxmlformats.org/officeDocument/2006/relationships" uri="GoogleDocsCustomDataVersion2">
-  <go:docsCustomData xmlns:go="http://customooxmlschemas.google.com/" roundtripDataSignature="AMtx7mjHGkBBYSMftQ6vZjjdNSGkrSc0ow==">CgMxLjA4AHIhMXFUNEtFQ19jOE9pVWRvbWpDeEU5UlctVDl6YzNnbGZn</go:docsCustomData>
+  <go:docsCustomData xmlns:go="http://customooxmlschemas.google.com/" roundtripDataSignature="AMtx7miSmKWS1GMU+Mu5hU4/gAOwjKvn7w==">CgMxLjA4AHIhMXpYZV9ZRHhvenVWa0dYRWpaSnVKa0FfYmJRWDdCeUZN</go:docsCustomData>
 </go:gDocsCustomXmlDataStorage>
 </file>
 

</xml_diff>